<commit_message>
Modernize UI: Complete premium pastel design system overhaul across all screens
</commit_message>
<xml_diff>
--- a/railway data.docx
+++ b/railway data.docx
@@ -368,7 +368,6 @@
         <w:tab/>
       </w:r>
       <w:proofErr w:type="spellStart"/>
-      <w:proofErr w:type="gramStart"/>
       <w:r>
         <w:t>jdbc:postgresql</w:t>
       </w:r>
@@ -376,7 +375,6 @@
       <w:r>
         <w:t>://postgres.railway.internal:5432/railway</w:t>
       </w:r>
-      <w:proofErr w:type="gramEnd"/>
     </w:p>
     <w:p/>
     <w:p>
@@ -448,11 +446,7 @@
     </w:p>
     <w:p>
       <w:r>
-        <w:t>RAILWAY_PRIVATE_</w:t>
-      </w:r>
-      <w:proofErr w:type="gramStart"/>
-      <w:r>
-        <w:t>DOMAIN</w:t>
+        <w:t>RAILWAY_PRIVATE_DOMAIN</w:t>
       </w:r>
       <w:r>
         <w:tab/>
@@ -462,7 +456,6 @@
         <w:t>provaluer.railway.internal</w:t>
       </w:r>
       <w:proofErr w:type="spellEnd"/>
-      <w:proofErr w:type="gramEnd"/>
     </w:p>
     <w:p>
       <w:r>
@@ -541,7 +534,29 @@
     </w:p>
     <w:p/>
     <w:p/>
-    <w:p/>
+    <w:p>
+      <w:r>
+        <w:t>Every time you change Java code, you </w:t>
+      </w:r>
+      <w:r>
+        <w:rPr>
+          <w:b/>
+          <w:bCs/>
+        </w:rPr>
+        <w:t>must</w:t>
+      </w:r>
+      <w:r>
+        <w:t> run .\gradlew.bat build -x test in </w:t>
+      </w:r>
+      <w:proofErr w:type="spellStart"/>
+      <w:r>
+        <w:t>BwVrBackend</w:t>
+      </w:r>
+      <w:proofErr w:type="spellEnd"/>
+      <w:r>
+        <w:t>/, copy the new JAR, and push it — because Railway uses the pre-compiled JAR from the repo, not source code.</w:t>
+      </w:r>
+    </w:p>
     <w:p/>
     <w:sectPr>
       <w:pgSz w:w="12240" w:h="15840"/>

</xml_diff>